<commit_message>
Quartz sync: 2025-01-01 20:08:36
</commit_message>
<xml_diff>
--- a/content/Auto-Generated/Attachments/Lincoln Award Employer Project - Project Log.docx
+++ b/content/Auto-Generated/Attachments/Lincoln Award Employer Project - Project Log.docx
@@ -26,7 +26,21 @@
           <w:b/>
           <w:bCs/>
         </w:rPr>
-        <w:t>4.5 hours per week</w:t>
+        <w:t>4.</w:t>
+      </w:r>
+      <w:r>
+        <w:rPr>
+          <w:b/>
+          <w:bCs/>
+        </w:rPr>
+        <w:t>6</w:t>
+      </w:r>
+      <w:r>
+        <w:rPr>
+          <w:b/>
+          <w:bCs/>
+        </w:rPr>
+        <w:t xml:space="preserve"> hours per week</w:t>
       </w:r>
       <w:r>
         <w:t xml:space="preserve"> on the project.</w:t>
@@ -488,16 +502,7 @@
                 <w:sz w:val="20"/>
                 <w:szCs w:val="20"/>
               </w:rPr>
-              <w:t>Attended first skills session</w:t>
-            </w:r>
-            <w:r>
-              <w:rPr>
-                <w:i/>
-                <w:iCs/>
-                <w:sz w:val="20"/>
-                <w:szCs w:val="20"/>
-              </w:rPr>
-              <w:t xml:space="preserve"> (skills)</w:t>
+              <w:t>Attended first skills session (skills)</w:t>
             </w:r>
           </w:p>
         </w:tc>
@@ -1288,14 +1293,7 @@
                 <w:sz w:val="20"/>
                 <w:szCs w:val="20"/>
               </w:rPr>
-              <w:t>6</w:t>
-            </w:r>
-            <w:r>
-              <w:rPr>
-                <w:sz w:val="20"/>
-                <w:szCs w:val="20"/>
-              </w:rPr>
-              <w:t xml:space="preserve"> hours</w:t>
+              <w:t>6 hours</w:t>
             </w:r>
           </w:p>
           <w:p>
@@ -1547,23 +1545,26 @@
                 <w:sz w:val="20"/>
                 <w:szCs w:val="20"/>
               </w:rPr>
-              <w:t xml:space="preserve">Week </w:t>
-            </w:r>
-            <w:r>
+              <w:t>Week 7 –</w:t>
+            </w:r>
+          </w:p>
+          <w:p>
+            <w:pPr>
+              <w:contextualSpacing/>
+              <w:jc w:val="center"/>
               <w:rPr>
                 <w:rStyle w:val="Strong"/>
                 <w:sz w:val="20"/>
                 <w:szCs w:val="20"/>
               </w:rPr>
-              <w:t>7</w:t>
-            </w:r>
+            </w:pPr>
             <w:r>
               <w:rPr>
                 <w:rStyle w:val="Strong"/>
                 <w:sz w:val="20"/>
                 <w:szCs w:val="20"/>
               </w:rPr>
-              <w:t xml:space="preserve"> –</w:t>
+              <w:t>Report</w:t>
             </w:r>
           </w:p>
           <w:p>
@@ -1571,63 +1572,16 @@
               <w:contextualSpacing/>
               <w:jc w:val="center"/>
               <w:rPr>
-                <w:rStyle w:val="Strong"/>
-                <w:sz w:val="20"/>
-                <w:szCs w:val="20"/>
-              </w:rPr>
-            </w:pPr>
-            <w:r>
-              <w:rPr>
-                <w:rStyle w:val="Strong"/>
-                <w:sz w:val="20"/>
-                <w:szCs w:val="20"/>
-              </w:rPr>
-              <w:t>Report</w:t>
-            </w:r>
-          </w:p>
-          <w:p>
-            <w:pPr>
-              <w:contextualSpacing/>
-              <w:jc w:val="center"/>
-              <w:rPr>
-                <w:sz w:val="20"/>
-                <w:szCs w:val="20"/>
-              </w:rPr>
-            </w:pPr>
-            <w:r>
-              <w:rPr>
-                <w:sz w:val="20"/>
-                <w:szCs w:val="20"/>
-              </w:rPr>
-              <w:t xml:space="preserve">(w/c </w:t>
-            </w:r>
-            <w:r>
-              <w:rPr>
-                <w:sz w:val="20"/>
-                <w:szCs w:val="20"/>
-              </w:rPr>
-              <w:t>02</w:t>
-            </w:r>
-            <w:r>
-              <w:rPr>
-                <w:sz w:val="20"/>
-                <w:szCs w:val="20"/>
-              </w:rPr>
-              <w:t>.1</w:t>
-            </w:r>
-            <w:r>
-              <w:rPr>
-                <w:sz w:val="20"/>
-                <w:szCs w:val="20"/>
-              </w:rPr>
-              <w:t>2</w:t>
-            </w:r>
-            <w:r>
-              <w:rPr>
-                <w:sz w:val="20"/>
-                <w:szCs w:val="20"/>
-              </w:rPr>
-              <w:t>.2024)</w:t>
+                <w:sz w:val="20"/>
+                <w:szCs w:val="20"/>
+              </w:rPr>
+            </w:pPr>
+            <w:r>
+              <w:rPr>
+                <w:sz w:val="20"/>
+                <w:szCs w:val="20"/>
+              </w:rPr>
+              <w:t>(w/c 02.12.2024)</w:t>
             </w:r>
           </w:p>
         </w:tc>
@@ -1777,23 +1731,26 @@
                 <w:sz w:val="20"/>
                 <w:szCs w:val="20"/>
               </w:rPr>
-              <w:t xml:space="preserve">Week </w:t>
-            </w:r>
-            <w:r>
+              <w:t>Week 8 –</w:t>
+            </w:r>
+          </w:p>
+          <w:p>
+            <w:pPr>
+              <w:contextualSpacing/>
+              <w:jc w:val="center"/>
               <w:rPr>
                 <w:rStyle w:val="Strong"/>
                 <w:sz w:val="20"/>
                 <w:szCs w:val="20"/>
               </w:rPr>
-              <w:t>8</w:t>
-            </w:r>
+            </w:pPr>
             <w:r>
               <w:rPr>
                 <w:rStyle w:val="Strong"/>
                 <w:sz w:val="20"/>
                 <w:szCs w:val="20"/>
               </w:rPr>
-              <w:t xml:space="preserve"> –</w:t>
+              <w:t>Editing</w:t>
             </w:r>
           </w:p>
           <w:p>
@@ -1801,49 +1758,16 @@
               <w:contextualSpacing/>
               <w:jc w:val="center"/>
               <w:rPr>
-                <w:rStyle w:val="Strong"/>
-                <w:sz w:val="20"/>
-                <w:szCs w:val="20"/>
-              </w:rPr>
-            </w:pPr>
-            <w:r>
-              <w:rPr>
-                <w:rStyle w:val="Strong"/>
-                <w:sz w:val="20"/>
-                <w:szCs w:val="20"/>
-              </w:rPr>
-              <w:t>Editing</w:t>
-            </w:r>
-          </w:p>
-          <w:p>
-            <w:pPr>
-              <w:contextualSpacing/>
-              <w:jc w:val="center"/>
-              <w:rPr>
-                <w:sz w:val="20"/>
-                <w:szCs w:val="20"/>
-              </w:rPr>
-            </w:pPr>
-            <w:r>
-              <w:rPr>
-                <w:sz w:val="20"/>
-                <w:szCs w:val="20"/>
-              </w:rPr>
-              <w:t>(w/c 0</w:t>
-            </w:r>
-            <w:r>
-              <w:rPr>
-                <w:sz w:val="20"/>
-                <w:szCs w:val="20"/>
-              </w:rPr>
-              <w:t>9</w:t>
-            </w:r>
-            <w:r>
-              <w:rPr>
-                <w:sz w:val="20"/>
-                <w:szCs w:val="20"/>
-              </w:rPr>
-              <w:t>.12.2024)</w:t>
+                <w:sz w:val="20"/>
+                <w:szCs w:val="20"/>
+              </w:rPr>
+            </w:pPr>
+            <w:r>
+              <w:rPr>
+                <w:sz w:val="20"/>
+                <w:szCs w:val="20"/>
+              </w:rPr>
+              <w:t>(w/c 09.12.2024)</w:t>
             </w:r>
           </w:p>
         </w:tc>
@@ -1967,7 +1891,21 @@
                 <w:sz w:val="20"/>
                 <w:szCs w:val="20"/>
               </w:rPr>
-              <w:t>1 hour</w:t>
+              <w:t>2</w:t>
+            </w:r>
+            <w:r>
+              <w:rPr>
+                <w:sz w:val="20"/>
+                <w:szCs w:val="20"/>
+              </w:rPr>
+              <w:t xml:space="preserve"> hour</w:t>
+            </w:r>
+            <w:r>
+              <w:rPr>
+                <w:sz w:val="20"/>
+                <w:szCs w:val="20"/>
+              </w:rPr>
+              <w:t>s</w:t>
             </w:r>
           </w:p>
           <w:p>
@@ -2278,7 +2216,14 @@
                 <w:sz w:val="20"/>
                 <w:szCs w:val="20"/>
               </w:rPr>
-              <w:t>45</w:t>
+              <w:t>4</w:t>
+            </w:r>
+            <w:r>
+              <w:rPr>
+                <w:sz w:val="20"/>
+                <w:szCs w:val="20"/>
+              </w:rPr>
+              <w:t>6</w:t>
             </w:r>
             <w:r>
               <w:rPr>
@@ -3588,6 +3533,7 @@
   <w:style w:type="character" w:default="1" w:styleId="DefaultParagraphFont">
     <w:name w:val="Default Paragraph Font"/>
     <w:uiPriority w:val="1"/>
+    <w:semiHidden/>
     <w:unhideWhenUsed/>
   </w:style>
   <w:style w:type="table" w:default="1" w:styleId="TableNormal">

</xml_diff>

<commit_message>
Quartz sync: 2025-01-06 22:14:57
</commit_message>
<xml_diff>
--- a/content/Auto-Generated/Attachments/Lincoln Award Employer Project - Project Log.docx
+++ b/content/Auto-Generated/Attachments/Lincoln Award Employer Project - Project Log.docx
@@ -26,14 +26,21 @@
           <w:b/>
           <w:bCs/>
         </w:rPr>
-        <w:t>4.</w:t>
+        <w:t>5</w:t>
       </w:r>
       <w:r>
         <w:rPr>
           <w:b/>
           <w:bCs/>
         </w:rPr>
-        <w:t>6</w:t>
+        <w:t>.</w:t>
+      </w:r>
+      <w:r>
+        <w:rPr>
+          <w:b/>
+          <w:bCs/>
+        </w:rPr>
+        <w:t>4</w:t>
       </w:r>
       <w:r>
         <w:rPr>
@@ -2030,7 +2037,27 @@
                 <w:sz w:val="20"/>
                 <w:szCs w:val="20"/>
               </w:rPr>
-              <w:t>...</w:t>
+              <w:t>Designed the slideshow and completed my portions.</w:t>
+            </w:r>
+          </w:p>
+          <w:p>
+            <w:pPr>
+              <w:pStyle w:val="ListParagraph"/>
+              <w:numPr>
+                <w:ilvl w:val="0"/>
+                <w:numId w:val="6"/>
+              </w:numPr>
+              <w:rPr>
+                <w:sz w:val="20"/>
+                <w:szCs w:val="20"/>
+              </w:rPr>
+            </w:pPr>
+            <w:r>
+              <w:rPr>
+                <w:sz w:val="20"/>
+                <w:szCs w:val="20"/>
+              </w:rPr>
+              <w:t>Attended final meetings to work on the slideshow and practice presenting.</w:t>
             </w:r>
           </w:p>
         </w:tc>
@@ -2047,6 +2074,29 @@
                 <w:szCs w:val="20"/>
               </w:rPr>
             </w:pPr>
+            <w:r>
+              <w:rPr>
+                <w:sz w:val="20"/>
+                <w:szCs w:val="20"/>
+              </w:rPr>
+              <w:t>4 hours</w:t>
+            </w:r>
+          </w:p>
+          <w:p>
+            <w:pPr>
+              <w:contextualSpacing/>
+              <w:rPr>
+                <w:sz w:val="20"/>
+                <w:szCs w:val="20"/>
+              </w:rPr>
+            </w:pPr>
+            <w:r>
+              <w:rPr>
+                <w:sz w:val="20"/>
+                <w:szCs w:val="20"/>
+              </w:rPr>
+              <w:t>4 hours</w:t>
+            </w:r>
           </w:p>
         </w:tc>
       </w:tr>
@@ -2216,14 +2266,7 @@
                 <w:sz w:val="20"/>
                 <w:szCs w:val="20"/>
               </w:rPr>
-              <w:t>4</w:t>
-            </w:r>
-            <w:r>
-              <w:rPr>
-                <w:sz w:val="20"/>
-                <w:szCs w:val="20"/>
-              </w:rPr>
-              <w:t>6</w:t>
+              <w:t>54</w:t>
             </w:r>
             <w:r>
               <w:rPr>

</xml_diff>